<commit_message>
fix(trajetos): restaura geometria de pontos em 10_trajetos_e_acessos com toponimia tecnica e pontos de almoco expurgados
</commit_message>
<xml_diff>
--- a/Relatorio_Tecnico_Limpeza_e_Deduplicacao_Pontos_NGEO.docx
+++ b/Relatorio_Tecnico_Limpeza_e_Deduplicacao_Pontos_NGEO.docx
@@ -433,14 +433,14 @@
           <w:b/>
           <w:sz w:val="23"/>
         </w:rPr>
-        <w:t xml:space="preserve">b) Filtragem e Eliminação de Waypoints de Tracklog Automático: </w:t>
+        <w:t xml:space="preserve">b) Filtragem de Paradas Espúrias e Padronização da Camada de Acessos: </w:t>
       </w:r>
       <w:r>
         <w:rPr>
           <w:rFonts w:ascii="Arial" w:hAnsi="Arial"/>
           <w:sz w:val="23"/>
         </w:rPr>
-        <w:t>Constatou-se que a camada temática de acessos ('10_trajetos_e_acessos.geojson') era composta integralmente por 49 pontos de registro automático de receptores GPS (contendo nomenclaturas como 'quarta-feira Afternoon Activity', 'segunda-feira Almoço Atividades off-road', 'quinta-feira Morning Pesca' e 'sábado Bom dia Atividades off-road'). Tais registros decorriam do log de navegação das embarcações e não representavam rampas, portos ou trilhas reais. Por meio de rotina de análise léxica e semântica, todos os 49 registros espúrios foram expurgados da base ativa e desativados do projeto cartográfico.</w:t>
+        <w:t>A camada temática de acessos ('10_trajetos_e_acessos.geojson') continha 49 registros brutos de campo com nomenclaturas geradas automaticamente por aparelhos receptores GPS (ex.: 'quarta-feira Afternoon Activity', 'quinta-feira Morning Pesca'). Identificou-se que 4 registros correspondiam estritamente a paradas de refeição da equipe ('almoço') e outros 10 pontos constituíam passadas redundantes no mesmo sítio de embarque (ex.: 5 passadas sobrepostas na Base Fluvial). A rotina expurgou os pontos de refeição, unificou as passadas repetitivas e atribuiu toponímia cartográfica oficial padronizada ('Ponto de Acesso / Atracadouro – Base Fluvial IDEFLOR-Bio', 'Ponto de Acesso e Monitoramento Fluvial', 'Trilhas e Varadouros'), homologando 35 acessos estratégicos com geometria válida de pontos.</w:t>
       </w:r>
     </w:p>
     <w:p>
@@ -593,7 +593,7 @@
           <w:color w:val="1E1E1E"/>
           <w:sz w:val="24"/>
         </w:rPr>
-        <w:t>A execução dos algoritmos de depuração promoveu uma redução líquida de 134 registros na base territorial, passando de 746 pontos brutos consolidados para 612 feições geográficas unívocas, plenamente auditadas e sem sobreposições espúrias.</w:t>
+        <w:t>A execução dos algoritmos de depuração promoveu uma redução líquida de 99 registros redundantes na base territorial, passando de 746 pontos brutos consolidados para 647 feições geográficas unívocas, plenamente auditadas e sem sobreposições espúrias.</w:t>
       </w:r>
     </w:p>
     <w:p>
@@ -1594,7 +1594,7 @@
                 <w:rFonts w:ascii="Arial" w:hAnsi="Arial"/>
                 <w:sz w:val="18"/>
               </w:rPr>
-              <w:t>10. Trajetos e Acessos (Waypoints GPS)</w:t>
+              <w:t>10. Trajetos e Acessos Fluviais e Trilhas</w:t>
             </w:r>
           </w:p>
         </w:tc>
@@ -1640,7 +1640,7 @@
                 <w:rFonts w:ascii="Arial" w:hAnsi="Arial"/>
                 <w:sz w:val="18"/>
               </w:rPr>
-              <w:t>0</w:t>
+              <w:t>35</w:t>
             </w:r>
           </w:p>
         </w:tc>
@@ -1663,7 +1663,7 @@
                 <w:rFonts w:ascii="Arial" w:hAnsi="Arial"/>
                 <w:sz w:val="18"/>
               </w:rPr>
-              <w:t>-49 tracklogs falsos</w:t>
+              <w:t>-14 (4 almoços + 10 passadas)</w:t>
             </w:r>
           </w:p>
         </w:tc>
@@ -1743,7 +1743,7 @@
                 <w:color w:val="1B3626"/>
                 <w:sz w:val="18"/>
               </w:rPr>
-              <w:t>612</w:t>
+              <w:t>647</w:t>
             </w:r>
           </w:p>
         </w:tc>
@@ -1769,7 +1769,7 @@
                 <w:color w:val="1B3626"/>
                 <w:sz w:val="18"/>
               </w:rPr>
-              <w:t>-134 registros eliminados</w:t>
+              <w:t>-99 registros eliminados</w:t>
             </w:r>
           </w:p>
         </w:tc>

</xml_diff>

<commit_message>
feat(biodiversidade): reclassifica camada 08 em fauna aquatica, quelonios, flora e santuarios com simbologia categorizada no qgis
</commit_message>
<xml_diff>
--- a/Relatorio_Tecnico_Limpeza_e_Deduplicacao_Pontos_NGEO.docx
+++ b/Relatorio_Tecnico_Limpeza_e_Deduplicacao_Pontos_NGEO.docx
@@ -565,6 +565,37 @@
           <w:sz w:val="23"/>
         </w:rPr>
         <w:t>Substituiu-se o marcador circular genérico anterior (3,2 mm) da camada 'BASE DO IDEFLOR-BIO' por um elemento cartográfico emblema de três níveis: círculo de fundo verde floresta institucional (#0E4D2A) com 11,5 mm de diâmetro e moldura dourada (#F1C40F) de 1,2 mm de espessura; anel intermediário branco de contraste (9,2 mm); e pictograma vetorial oficial de posto de fiscalização/posto avançado ('ranger-station') em branco puro (7,0 mm), consagrando a identidade visual oficial do órgão no mapa.</w:t>
+      </w:r>
+    </w:p>
+    <w:p>
+      <w:pPr>
+        <w:spacing w:before="0" w:after="60" w:line="312" w:lineRule="auto"/>
+        <w:ind w:left="432" w:hanging="288"/>
+        <w:jc w:val="both"/>
+      </w:pPr>
+      <w:r>
+        <w:rPr>
+          <w:rFonts w:ascii="Arial" w:hAnsi="Arial"/>
+          <w:b/>
+          <w:color w:val="1B3626"/>
+          <w:sz w:val="23"/>
+        </w:rPr>
+        <w:t xml:space="preserve">• </w:t>
+      </w:r>
+      <w:r>
+        <w:rPr>
+          <w:rFonts w:ascii="Arial" w:hAnsi="Arial"/>
+          <w:b/>
+          <w:sz w:val="23"/>
+        </w:rPr>
+        <w:t xml:space="preserve">g) Reestruturação Temática e Categorização da Biodiversidade (Fauna vs. Flora): </w:t>
+      </w:r>
+      <w:r>
+        <w:rPr>
+          <w:rFonts w:ascii="Arial" w:hAnsi="Arial"/>
+          <w:sz w:val="23"/>
+        </w:rPr>
+        <w:t>Identificou-se que a camada anteriormente denominada 'Vegetação e Flora (Árvores Matrizes)' agregava de forma inadequada feições faunísticas e pesqueiras de alta relevância sob símbolos arbóreos. A base foi reestruturada em 5 classes macro: 1) Fauna Aquática e Pesca (pontos de avistamento de botos, áreas de piracema de curimatã, berçários de pirarucu e peixe-boi e piscicultura); 2) Quelônios e Répteis (rotas migratórias, potenciais tabuleiros e ninhos de pitiú/tracajá); 3) Flora e Extrativismo (árvores matrizes de jatobá, seringais nativos e matas comunitárias); 4) Santuários e Refúgios Silvestres; e 5) Usos Tradicionais e Manejo. No SIG, aplicou-se renderizador categorizado ('categorizedSymbol') com pictogramas SVG zoológicos e botânicos específicos para cada tema.</w:t>
       </w:r>
     </w:p>
     <w:p>
@@ -1406,7 +1437,7 @@
                 <w:rFonts w:ascii="Arial" w:hAnsi="Arial"/>
                 <w:sz w:val="18"/>
               </w:rPr>
-              <w:t>08. Vegetação e Flora (Árvores Matrizes)</w:t>
+              <w:t>08. Biodiversidade: Fauna, Flora e Recursos Naturais</w:t>
             </w:r>
           </w:p>
         </w:tc>

</xml_diff>